<commit_message>
Guides techniques : passage à podman + systemd (Quadlet)
Les trois guides d'exploitation décrivaient une installation Docker
Compose qui n'existe plus.

- Installation 8 serveurs : podman depuis bookworm-backports (Quadlet
  exige 4.4), aardvark-dns obligatoire, installation par rôle via
  install-units.sh et transfer-images.sh
- Mise à jour production : la production n'ayant pas d'accès Internet,
  les images sont construites sur une machine de préparation puis
  transférées (podman save / load) ; les changements de version passent
  par l'édition de l'unité et un daemon-reload
- Installation VirtualBox : podman fourni par Ubuntu 24.04, mode rootful
  et magasin d'images distinct de celui de l'utilisateur

Corrige au passage la vérification post-mise-à-jour du guide de
production : /search est une route POST, la commande curl fournie ne
pouvait pas fonctionner.

Co-Authored-By: Claude Opus 5 <noreply@anthropic.com>
</commit_message>
<xml_diff>
--- a/guide_install_production_8_serveurs.docx
+++ b/guide_install_production_8_serveurs.docx
@@ -47,7 +47,7 @@
           <w:sz w:val="22"/>
           <w:szCs w:val="22"/>
         </w:rPr>
-        <w:t xml:space="preserve">Debian 12 · Docker Compose · Elasticsearch 9.4.3</w:t>
+        <w:t xml:space="preserve">Debian 12 · podman + systemd (Quadlet) · Elasticsearch 9.4.3</w:t>
       </w:r>
     </w:p>
     <w:tbl>
@@ -2390,7 +2390,7 @@
                 <w:sz w:val="20"/>
                 <w:szCs w:val="20"/>
               </w:rPr>
-              <w:t xml:space="preserve">Variable .env</w:t>
+              <w:t xml:space="preserve">Variable (docsearch.env)</w:t>
             </w:r>
           </w:p>
         </w:tc>
@@ -3122,7 +3122,7 @@
         <w:spacing w:after="150" w:before="300"/>
       </w:pPr>
       <w:r>
-        <w:t xml:space="preserve">5.3 Docker Engine + plugin Compose</w:t>
+        <w:t xml:space="preserve">5.3 podman (moteur de conteneurs)</w:t>
       </w:r>
     </w:p>
     <w:tbl>
@@ -3161,46 +3161,46 @@
                 <w:sz w:val="19"/>
                 <w:szCs w:val="19"/>
               </w:rPr>
-              <w:t xml:space="preserve">curl -fsSL https://get.docker.com | sudo sh</w:t>
-            </w:r>
-          </w:p>
-          <w:p>
-            <w:pPr>
-              <w:spacing w:after="20"/>
-            </w:pPr>
-            <w:r>
-              <w:rPr>
-                <w:rFonts w:ascii="Consolas" w:cs="Consolas" w:eastAsia="Consolas" w:hAnsi="Consolas"/>
-                <w:sz w:val="19"/>
-                <w:szCs w:val="19"/>
-              </w:rPr>
-              <w:t xml:space="preserve">sudo usermod -aG docker $USER</w:t>
-            </w:r>
-          </w:p>
-          <w:p>
-            <w:pPr>
-              <w:spacing w:after="20"/>
-            </w:pPr>
-            <w:r>
-              <w:rPr>
-                <w:rFonts w:ascii="Consolas" w:cs="Consolas" w:eastAsia="Consolas" w:hAnsi="Consolas"/>
-                <w:sz w:val="19"/>
-                <w:szCs w:val="19"/>
-              </w:rPr>
-              <w:t xml:space="preserve"># Se déconnecter/reconnecter (ou 'newgrp docker') pour que le groupe s'applique</w:t>
-            </w:r>
-          </w:p>
-          <w:p>
-            <w:pPr>
-              <w:spacing w:after="20"/>
-            </w:pPr>
-            <w:r>
-              <w:rPr>
-                <w:rFonts w:ascii="Consolas" w:cs="Consolas" w:eastAsia="Consolas" w:hAnsi="Consolas"/>
-                <w:sz w:val="19"/>
-                <w:szCs w:val="19"/>
-              </w:rPr>
-              <w:t xml:space="preserve">docker compose version   # doit afficher v2.x</w:t>
+              <w:t xml:space="preserve">sudo apt-get install -y -t bookworm-backports podman netavark aardvark-dns</w:t>
+            </w:r>
+          </w:p>
+          <w:p>
+            <w:pPr>
+              <w:spacing w:after="20"/>
+            </w:pPr>
+            <w:r>
+              <w:rPr>
+                <w:rFonts w:ascii="Consolas" w:cs="Consolas" w:eastAsia="Consolas" w:hAnsi="Consolas"/>
+                <w:sz w:val="19"/>
+                <w:szCs w:val="19"/>
+              </w:rPr>
+              <w:t xml:space="preserve"># Backports OBLIGATOIRE : Quadlet exige podman &gt;= 4.4, trop récent pour Debian 12 stable</w:t>
+            </w:r>
+          </w:p>
+          <w:p>
+            <w:pPr>
+              <w:spacing w:after="20"/>
+            </w:pPr>
+            <w:r>
+              <w:rPr>
+                <w:rFonts w:ascii="Consolas" w:cs="Consolas" w:eastAsia="Consolas" w:hAnsi="Consolas"/>
+                <w:sz w:val="19"/>
+                <w:szCs w:val="19"/>
+              </w:rPr>
+              <w:t xml:space="preserve"># aardvark-dns est indispensable : sans lui, aucun conteneur ne résout le nom d'un autre</w:t>
+            </w:r>
+          </w:p>
+          <w:p>
+            <w:pPr>
+              <w:spacing w:after="20"/>
+            </w:pPr>
+            <w:r>
+              <w:rPr>
+                <w:rFonts w:ascii="Consolas" w:cs="Consolas" w:eastAsia="Consolas" w:hAnsi="Consolas"/>
+                <w:sz w:val="19"/>
+                <w:szCs w:val="19"/>
+              </w:rPr>
+              <w:t xml:space="preserve">podman --version   # doit afficher 4.4 ou plus</w:t>
             </w:r>
           </w:p>
         </w:tc>
@@ -3277,7 +3277,7 @@
                 <w:sz w:val="19"/>
                 <w:szCs w:val="19"/>
               </w:rPr>
-              <w:t xml:space="preserve">echo 'vm.max_map_count=262144' | sudo tee -a /etc/sysctl.conf</w:t>
+              <w:t xml:space="preserve">echo 'vm.max_map_count=262144' | sudo tee /etc/sysctl.d/99-docsearch.conf</w:t>
             </w:r>
           </w:p>
         </w:tc>
@@ -3670,33 +3670,33 @@
                 <w:sz w:val="19"/>
                 <w:szCs w:val="19"/>
               </w:rPr>
-              <w:t xml:space="preserve">cd docsearch-infra/multi-host</w:t>
-            </w:r>
-          </w:p>
-          <w:p>
-            <w:pPr>
-              <w:spacing w:after="20"/>
-            </w:pPr>
-            <w:r>
-              <w:rPr>
-                <w:rFonts w:ascii="Consolas" w:cs="Consolas" w:eastAsia="Consolas" w:hAnsi="Consolas"/>
-                <w:sz w:val="19"/>
-                <w:szCs w:val="19"/>
-              </w:rPr>
-              <w:t xml:space="preserve">cp .env.example .env</w:t>
-            </w:r>
-          </w:p>
-          <w:p>
-            <w:pPr>
-              <w:spacing w:after="20"/>
-            </w:pPr>
-            <w:r>
-              <w:rPr>
-                <w:rFonts w:ascii="Consolas" w:cs="Consolas" w:eastAsia="Consolas" w:hAnsi="Consolas"/>
-                <w:sz w:val="19"/>
-                <w:szCs w:val="19"/>
-              </w:rPr>
-              <w:t xml:space="preserve">nano .env   # renseigner les 8 IP réelles — fichier IDENTIQUE sur les 8 machines</w:t>
+              <w:t xml:space="preserve">cd docsearch-infra</w:t>
+            </w:r>
+          </w:p>
+          <w:p>
+            <w:pPr>
+              <w:spacing w:after="20"/>
+            </w:pPr>
+            <w:r>
+              <w:rPr>
+                <w:rFonts w:ascii="Consolas" w:cs="Consolas" w:eastAsia="Consolas" w:hAnsi="Consolas"/>
+                <w:sz w:val="19"/>
+                <w:szCs w:val="19"/>
+              </w:rPr>
+              <w:t xml:space="preserve"># Les images ne se construisent PAS ici : la production n'a pas d'accès Internet.</w:t>
+            </w:r>
+          </w:p>
+          <w:p>
+            <w:pPr>
+              <w:spacing w:after="20"/>
+            </w:pPr>
+            <w:r>
+              <w:rPr>
+                <w:rFonts w:ascii="Consolas" w:cs="Consolas" w:eastAsia="Consolas" w:hAnsi="Consolas"/>
+                <w:sz w:val="19"/>
+                <w:szCs w:val="19"/>
+              </w:rPr>
+              <w:t xml:space="preserve"># Elles arrivent d'une machine de préparation (voir HOWTO-deploiement-hors-ligne.md).</w:t>
             </w:r>
           </w:p>
         </w:tc>
@@ -3842,7 +3842,7 @@
           <w:sz w:val="22"/>
           <w:szCs w:val="22"/>
         </w:rPr>
-        <w:t xml:space="preserve">Puis, depuis ~/docsearch/docsearch-infra/multi-host :</w:t>
+        <w:t xml:space="preserve">Puis, depuis ~/docsearch/docsearch-infra :</w:t>
       </w:r>
     </w:p>
     <w:tbl>
@@ -3894,7 +3894,7 @@
                 <w:sz w:val="19"/>
                 <w:szCs w:val="19"/>
               </w:rPr>
-              <w:t xml:space="preserve">NODE_NAME=es01 docker compose -f docker-compose.es-data.yml up -d</w:t>
+              <w:t xml:space="preserve">sudo ./quadlet/install-units.sh es-data   # puis node.name=es01 dans /etc/docsearch/elasticsearch.env</w:t>
             </w:r>
           </w:p>
           <w:p>
@@ -3933,7 +3933,7 @@
                 <w:sz w:val="19"/>
                 <w:szCs w:val="19"/>
               </w:rPr>
-              <w:t xml:space="preserve">NODE_NAME=es02 docker compose -f docker-compose.es-data.yml up -d</w:t>
+              <w:t xml:space="preserve">sudo ./quadlet/install-units.sh es-data   # puis node.name=es02 dans /etc/docsearch/elasticsearch.env</w:t>
             </w:r>
           </w:p>
         </w:tc>
@@ -3984,7 +3984,7 @@
                 <w:sz w:val="19"/>
                 <w:szCs w:val="19"/>
               </w:rPr>
-              <w:t xml:space="preserve">docker compose -f docker-compose.es-voting.yml up -d</w:t>
+              <w:t xml:space="preserve">sudo ./quadlet/install-units.sh es-voting &amp;&amp; sudo systemctl start docsearch.target</w:t>
             </w:r>
           </w:p>
         </w:tc>
@@ -4103,7 +4103,7 @@
                 <w:sz w:val="19"/>
                 <w:szCs w:val="19"/>
               </w:rPr>
-              <w:t xml:space="preserve">docker compose -f docker-compose.kafka.yml up -d</w:t>
+              <w:t xml:space="preserve">sudo ./quadlet/install-units.sh kafka   # renseigner l'IP réelle dans /etc/docsearch/kafka.env</w:t>
             </w:r>
           </w:p>
         </w:tc>
@@ -4248,7 +4248,7 @@
                 <w:sz w:val="19"/>
                 <w:szCs w:val="19"/>
               </w:rPr>
-              <w:t xml:space="preserve">mkdir -p ../nginx/certs</w:t>
+              <w:t xml:space="preserve">sudo ./quadlet/install-units.sh frontend &amp;&amp; sudo mkdir -p /etc/docsearch/nginx/certs</w:t>
             </w:r>
           </w:p>
           <w:p>
@@ -4274,7 +4274,7 @@
                 <w:sz w:val="19"/>
                 <w:szCs w:val="19"/>
               </w:rPr>
-              <w:t xml:space="preserve">  -keyout ../nginx/certs/key.pem -out ../nginx/certs/cert.pem \</w:t>
+              <w:t xml:space="preserve">  -keyout /etc/docsearch/nginx/certs/key.pem -out /etc/docsearch/nginx/certs/cert.pem \</w:t>
             </w:r>
           </w:p>
           <w:p>
@@ -4300,7 +4300,7 @@
                 <w:sz w:val="19"/>
                 <w:szCs w:val="19"/>
               </w:rPr>
-              <w:t xml:space="preserve">docker compose -f docker-compose.frontend.yml up -d --build</w:t>
+              <w:t xml:space="preserve">sudo ./quadlet/transfer-images.sh frontend   # images venues de la machine de préparation</w:t>
             </w:r>
           </w:p>
         </w:tc>
@@ -4364,33 +4364,33 @@
                 <w:sz w:val="19"/>
                 <w:szCs w:val="19"/>
               </w:rPr>
-              <w:t xml:space="preserve"># ingest-1 uniquement (services singletons watcher + indexer-init) :</w:t>
-            </w:r>
-          </w:p>
-          <w:p>
-            <w:pPr>
-              <w:spacing w:after="20"/>
-            </w:pPr>
-            <w:r>
-              <w:rPr>
-                <w:rFonts w:ascii="Consolas" w:cs="Consolas" w:eastAsia="Consolas" w:hAnsi="Consolas"/>
-                <w:sz w:val="19"/>
-                <w:szCs w:val="19"/>
-              </w:rPr>
-              <w:t xml:space="preserve">docker compose -f docker-compose.ingest.yml \</w:t>
-            </w:r>
-          </w:p>
-          <w:p>
-            <w:pPr>
-              <w:spacing w:after="20"/>
-            </w:pPr>
-            <w:r>
-              <w:rPr>
-                <w:rFonts w:ascii="Consolas" w:cs="Consolas" w:eastAsia="Consolas" w:hAnsi="Consolas"/>
-                <w:sz w:val="19"/>
-                <w:szCs w:val="19"/>
-              </w:rPr>
-              <w:t xml:space="preserve">                -f docker-compose.ingest1-extra.yml up -d --build</w:t>
+              <w:t xml:space="preserve"># ingest-1 uniquement (le watcher est un singleton) :</w:t>
+            </w:r>
+          </w:p>
+          <w:p>
+            <w:pPr>
+              <w:spacing w:after="20"/>
+            </w:pPr>
+            <w:r>
+              <w:rPr>
+                <w:rFonts w:ascii="Consolas" w:cs="Consolas" w:eastAsia="Consolas" w:hAnsi="Consolas"/>
+                <w:sz w:val="19"/>
+                <w:szCs w:val="19"/>
+              </w:rPr>
+              <w:t xml:space="preserve">sudo ./quadlet/install-units.sh ingest --with-singletons</w:t>
+            </w:r>
+          </w:p>
+          <w:p>
+            <w:pPr>
+              <w:spacing w:after="20"/>
+            </w:pPr>
+            <w:r>
+              <w:rPr>
+                <w:rFonts w:ascii="Consolas" w:cs="Consolas" w:eastAsia="Consolas" w:hAnsi="Consolas"/>
+                <w:sz w:val="19"/>
+                <w:szCs w:val="19"/>
+              </w:rPr>
+              <w:t xml:space="preserve">sudo ./quadlet/transfer-images.sh ingest</w:t>
             </w:r>
           </w:p>
           <w:p>
@@ -4429,7 +4429,7 @@
                 <w:sz w:val="19"/>
                 <w:szCs w:val="19"/>
               </w:rPr>
-              <w:t xml:space="preserve">docker compose -f docker-compose.ingest.yml up -d --build</w:t>
+              <w:t xml:space="preserve">sudo ./quadlet/install-units.sh ingest &amp;&amp; sudo ./quadlet/transfer-images.sh ingest</w:t>
             </w:r>
           </w:p>
         </w:tc>
@@ -4454,7 +4454,7 @@
           <w:sz w:val="22"/>
           <w:szCs w:val="22"/>
         </w:rPr>
-        <w:t xml:space="preserve">L'ordre compte : Kafka doit être opérationnel avant les workers/watcher, l'API a besoin de Redis, Nginx a besoin de l'API.</w:t>
+        <w:t xml:space="preserve">L'ordre compte : Kafka doit être opérationnel avant les workers/watcher, l'API a besoin de Redis, Nginx a besoin de l'API. Sur chaque machine, le démarrage se fait par « sudo systemctl start docsearch.target » (ou « sudo ./manage.sh start »), dans cet ordre :</w:t>
       </w:r>
     </w:p>
     <w:p>
@@ -4544,7 +4544,7 @@
           <w:sz w:val="22"/>
           <w:szCs w:val="22"/>
         </w:rPr>
-        <w:t xml:space="preserve">5. ingest-1 (avec les services singletons)</w:t>
+        <w:t xml:space="preserve">5. ingest-1 (avec le watcher)</w:t>
       </w:r>
     </w:p>
     <w:p>
@@ -4667,7 +4667,7 @@
                 <w:sz w:val="19"/>
                 <w:szCs w:val="19"/>
               </w:rPr>
-              <w:t xml:space="preserve">docker exec docsearch-kafka kafka-topics --bootstrap-server localhost:9092 --list</w:t>
+              <w:t xml:space="preserve">sudo podman exec docsearch-kafka kafka-topics --bootstrap-server localhost:9092 --list</w:t>
             </w:r>
           </w:p>
           <w:p>
@@ -4770,7 +4770,7 @@
           <w:sz w:val="22"/>
           <w:szCs w:val="22"/>
         </w:rPr>
-        <w:t xml:space="preserve">Depuis ingest-1 uniquement (seule machine où vit indexer-init) :</w:t>
+        <w:t xml:space="preserve">Depuis ingest-1 uniquement (seule machine où tourne le watcher) :</w:t>
       </w:r>
     </w:p>
     <w:tbl>
@@ -4809,46 +4809,46 @@
                 <w:sz w:val="19"/>
                 <w:szCs w:val="19"/>
               </w:rPr>
-              <w:t xml:space="preserve">cd ~/docsearch/docsearch-infra/multi-host</w:t>
-            </w:r>
-          </w:p>
-          <w:p>
-            <w:pPr>
-              <w:spacing w:after="20"/>
-            </w:pPr>
-            <w:r>
-              <w:rPr>
-                <w:rFonts w:ascii="Consolas" w:cs="Consolas" w:eastAsia="Consolas" w:hAnsi="Consolas"/>
-                <w:sz w:val="19"/>
-                <w:szCs w:val="19"/>
-              </w:rPr>
-              <w:t xml:space="preserve">docker compose -f docker-compose.ingest.yml \</w:t>
-            </w:r>
-          </w:p>
-          <w:p>
-            <w:pPr>
-              <w:spacing w:after="20"/>
-            </w:pPr>
-            <w:r>
-              <w:rPr>
-                <w:rFonts w:ascii="Consolas" w:cs="Consolas" w:eastAsia="Consolas" w:hAnsi="Consolas"/>
-                <w:sz w:val="19"/>
-                <w:szCs w:val="19"/>
-              </w:rPr>
-              <w:t xml:space="preserve">                -f docker-compose.ingest1-extra.yml \</w:t>
-            </w:r>
-          </w:p>
-          <w:p>
-            <w:pPr>
-              <w:spacing w:after="20"/>
-            </w:pPr>
-            <w:r>
-              <w:rPr>
-                <w:rFonts w:ascii="Consolas" w:cs="Consolas" w:eastAsia="Consolas" w:hAnsi="Consolas"/>
-                <w:sz w:val="19"/>
-                <w:szCs w:val="19"/>
-              </w:rPr>
-              <w:t xml:space="preserve">                --profile init run --rm indexer-init python producer.py</w:t>
+              <w:t xml:space="preserve">cd ~/docsearch/docsearch-infra</w:t>
+            </w:r>
+          </w:p>
+          <w:p>
+            <w:pPr>
+              <w:spacing w:after="20"/>
+            </w:pPr>
+            <w:r>
+              <w:rPr>
+                <w:rFonts w:ascii="Consolas" w:cs="Consolas" w:eastAsia="Consolas" w:hAnsi="Consolas"/>
+                <w:sz w:val="19"/>
+                <w:szCs w:val="19"/>
+              </w:rPr>
+              <w:t xml:space="preserve">sudo ./manage.sh init</w:t>
+            </w:r>
+          </w:p>
+          <w:p>
+            <w:pPr>
+              <w:spacing w:after="20"/>
+            </w:pPr>
+            <w:r>
+              <w:rPr>
+                <w:rFonts w:ascii="Consolas" w:cs="Consolas" w:eastAsia="Consolas" w:hAnsi="Consolas"/>
+                <w:sz w:val="19"/>
+                <w:szCs w:val="19"/>
+              </w:rPr>
+              <w:t xml:space="preserve"># (producer.py s'exécute dans un conteneur jetable sur l'image ingestion)</w:t>
+            </w:r>
+          </w:p>
+          <w:p>
+            <w:pPr>
+              <w:spacing w:after="20"/>
+            </w:pPr>
+            <w:r>
+              <w:rPr>
+                <w:rFonts w:ascii="Consolas" w:cs="Consolas" w:eastAsia="Consolas" w:hAnsi="Consolas"/>
+                <w:sz w:val="19"/>
+                <w:szCs w:val="19"/>
+              </w:rPr>
+              <w:t xml:space="preserve"># Suivre l'avancement : ./manage.sh logs worker</w:t>
             </w:r>
           </w:p>
         </w:tc>
@@ -4944,7 +4944,7 @@
           <w:sz w:val="22"/>
           <w:szCs w:val="22"/>
         </w:rPr>
-        <w:t xml:space="preserve">Vérifier que la ligne a bien été ajoutée à /etc/sysctl.conf (§5.4), pas seulement appliquée à chaud avec sysctl -w.</w:t>
+        <w:t xml:space="preserve">Vérifier que la ligne a bien été écrite dans /etc/sysctl.d/99-docsearch.conf (§5.4), pas seulement appliquée à chaud avec sysctl -w.</w:t>
       </w:r>
     </w:p>
     <w:p>
@@ -4966,7 +4966,7 @@
           <w:sz w:val="22"/>
           <w:szCs w:val="22"/>
         </w:rPr>
-        <w:t xml:space="preserve">KAFKA_ADVERTISED_LISTENERS doit annoncer l'IP réelle de la machine kafka (KAFKA_IP), jamais un nom de conteneur Docker — contrairement au mode mono-hôte, les autres machines ne peuvent pas résoudre ce nom.</w:t>
+        <w:t xml:space="preserve">KAFKA_ADVERTISED_LISTENERS doit annoncer l'IP réelle de la machine kafka (KAFKA_IP), jamais un nom de conteneur — contrairement au mono-hôte, les machines ne partagent aucun réseau de conteneurs et se joignent uniquement par IP.</w:t>
       </w:r>
     </w:p>
     <w:p>
@@ -4988,7 +4988,7 @@
           <w:sz w:val="22"/>
           <w:szCs w:val="22"/>
         </w:rPr>
-        <w:t xml:space="preserve">Les fichiers Docker Compose et le README détaillé correspondant à ce document se trouvent dans le dépôt docsearch-infra :</w:t>
+        <w:t xml:space="preserve">Les unités systemd et le README détaillé correspondant à ce document se trouvent dans le dépôt docsearch-infra :</w:t>
       </w:r>
     </w:p>
     <w:p>
@@ -5006,7 +5006,7 @@
           <w:sz w:val="22"/>
           <w:szCs w:val="22"/>
         </w:rPr>
-        <w:t xml:space="preserve">docsearch-infra/multi-host/.env.example</w:t>
+        <w:t xml:space="preserve">docsearch-infra/quadlet/install-units.sh   (installation des unités par rôle)</w:t>
       </w:r>
     </w:p>
     <w:p>
@@ -5024,7 +5024,7 @@
           <w:sz w:val="22"/>
           <w:szCs w:val="22"/>
         </w:rPr>
-        <w:t xml:space="preserve">docsearch-infra/multi-host/docker-compose.es-data.yml</w:t>
+        <w:t xml:space="preserve">docsearch-infra/quadlet/transfer-images.sh   (mise en place des images côté root)</w:t>
       </w:r>
     </w:p>
     <w:p>
@@ -5042,7 +5042,7 @@
           <w:sz w:val="22"/>
           <w:szCs w:val="22"/>
         </w:rPr>
-        <w:t xml:space="preserve">docsearch-infra/multi-host/docker-compose.es-voting.yml</w:t>
+        <w:t xml:space="preserve">docsearch-infra/quadlet/common/   (cible docsearch.target, réseau, modèles de configuration)</w:t>
       </w:r>
     </w:p>
     <w:p>
@@ -5060,7 +5060,7 @@
           <w:sz w:val="22"/>
           <w:szCs w:val="22"/>
         </w:rPr>
-        <w:t xml:space="preserve">docsearch-infra/multi-host/docker-compose.kafka.yml</w:t>
+        <w:t xml:space="preserve">docsearch-infra/quadlet/roles/es-data/ · es-voting/ · kafka/</w:t>
       </w:r>
     </w:p>
     <w:p>
@@ -5078,7 +5078,7 @@
           <w:sz w:val="22"/>
           <w:szCs w:val="22"/>
         </w:rPr>
-        <w:t xml:space="preserve">docsearch-infra/multi-host/docker-compose.frontend.yml</w:t>
+        <w:t xml:space="preserve">docsearch-infra/quadlet/roles/frontend/ · ingest/</w:t>
       </w:r>
     </w:p>
     <w:p>
@@ -5096,7 +5096,7 @@
           <w:sz w:val="22"/>
           <w:szCs w:val="22"/>
         </w:rPr>
-        <w:t xml:space="preserve">docsearch-infra/multi-host/docker-compose.ingest.yml</w:t>
+        <w:t xml:space="preserve">docsearch-infra/quadlet/README.md   (installation, dépannage, prérequis podman)</w:t>
       </w:r>
     </w:p>
     <w:p>
@@ -5114,7 +5114,7 @@
           <w:sz w:val="22"/>
           <w:szCs w:val="22"/>
         </w:rPr>
-        <w:t xml:space="preserve">docsearch-infra/multi-host/docker-compose.ingest1-extra.yml</w:t>
+        <w:t xml:space="preserve">docsearch-infra/HOWTO-deploiement-hors-ligne.md   (transfert des images)</w:t>
       </w:r>
     </w:p>
     <w:p>
@@ -5132,7 +5132,7 @@
           <w:sz w:val="22"/>
           <w:szCs w:val="22"/>
         </w:rPr>
-        <w:t xml:space="preserve">docsearch-infra/multi-host/README.md</w:t>
+        <w:t xml:space="preserve">docsearch-infra/HOWTO-commandes-utiles.md   (exploitation au quotidien)</w:t>
       </w:r>
     </w:p>
     <w:p>
@@ -5178,7 +5178,7 @@
                 <w:sz w:val="22"/>
                 <w:szCs w:val="22"/>
               </w:rPr>
-              <w:t xml:space="preserve">💡  manage.sh reste un outil mono-hôte</w:t>
+              <w:t xml:space="preserve">💡  manage.sh fonctionne sur les 8 machines</w:t>
             </w:r>
           </w:p>
           <w:p>
@@ -5191,7 +5191,7 @@
                 <w:sz w:val="21"/>
                 <w:szCs w:val="21"/>
               </w:rPr>
-              <w:t xml:space="preserve">Le script manage.sh à la racine de docsearch-infra suppose un déploiement sur une seule machine (docker-compose.yml racine). Il n'est pas utilisable tel quel pour ce déploiement à 8 machines — chaque serveur invoque directement docker compose avec son propre fichier, voir §6.</w:t>
+              <w:t xml:space="preserve">Le script manage.sh à la racine de docsearch-infra pilote les unités systemd de la machine où il est lancé, quel que soit son rôle : start/stop/restart, status, journaux, et les commandes d'administration (init, add-file-source, set-config…) qui s'exécutent dans un conteneur jetable. Il exige sudo pour tout ce qui touche aux unités, au réseau ou aux images.</w:t>
             </w:r>
           </w:p>
         </w:tc>

</xml_diff>